<commit_message>
feat: tài liệu Permission_Matrix, API_Design,  DB_V04
</commit_message>
<xml_diff>
--- a/docs/Permission_Matrix_v2.0_3_Phase.docx
+++ b/docs/Permission_Matrix_v2.0_3_Phase.docx
@@ -554,7 +554,7 @@
         <w:pStyle w:val="ListBullet"/>
       </w:pPr>
       <w:r>
-        <w:t>APPLY: Customer áp dụng Voucher vào Booking.</w:t>
+        <w:t>APPLY: Customer áp dụng Voucher vào Booking. CLAIM: Customer nhận voucher GLOBAL từ Kho voucher vào ví của mình. WALLET_READ_SELF: Customer xem ví và lịch sử giao dịch của chính mình.</w:t>
       </w:r>
     </w:p>
     <w:p>
@@ -5050,10 +5050,7 @@
           </w:tcPr>
           <w:p>
             <w:r>
-              <w:rPr>
-                <w:sz w:val="16"/>
-              </w:rPr>
-              <w:t>News Category</w:t>
+              <w:t>Voucher</w:t>
             </w:r>
           </w:p>
         </w:tc>
@@ -5064,66 +5061,51 @@
           </w:tcPr>
           <w:p>
             <w:r>
-              <w:rPr>
-                <w:sz w:val="16"/>
-              </w:rPr>
-              <w:t>NEWS_CATEGORY_READ</w:t>
-            </w:r>
-          </w:p>
-        </w:tc>
-        <w:tc>
-          <w:tcPr>
-            <w:tcW w:w="792" w:type="dxa"/>
-            <w:vAlign w:val="center"/>
-          </w:tcPr>
-          <w:p>
-            <w:r>
-              <w:rPr>
-                <w:sz w:val="16"/>
-              </w:rPr>
+              <w:t>VOUCHER_CLAIM</w:t>
+            </w:r>
+          </w:p>
+        </w:tc>
+        <w:tc>
+          <w:tcPr>
+            <w:tcW w:w="792" w:type="dxa"/>
+            <w:vAlign w:val="center"/>
+          </w:tcPr>
+          <w:p>
+            <w:r>
+              <w:t>—</w:t>
+            </w:r>
+          </w:p>
+        </w:tc>
+        <w:tc>
+          <w:tcPr>
+            <w:tcW w:w="1132" w:type="dxa"/>
+            <w:vAlign w:val="center"/>
+          </w:tcPr>
+          <w:p>
+            <w:r>
               <w:t>✅</w:t>
             </w:r>
           </w:p>
         </w:tc>
         <w:tc>
           <w:tcPr>
-            <w:tcW w:w="1132" w:type="dxa"/>
-            <w:vAlign w:val="center"/>
-          </w:tcPr>
-          <w:p>
-            <w:r>
-              <w:rPr>
-                <w:sz w:val="16"/>
-              </w:rPr>
-              <w:t>✅</w:t>
-            </w:r>
-          </w:p>
-        </w:tc>
-        <w:tc>
-          <w:tcPr>
-            <w:tcW w:w="792" w:type="dxa"/>
-            <w:vAlign w:val="center"/>
-          </w:tcPr>
-          <w:p>
-            <w:r>
-              <w:rPr>
-                <w:sz w:val="16"/>
-              </w:rPr>
-              <w:t>✅</w:t>
-            </w:r>
-          </w:p>
-        </w:tc>
-        <w:tc>
-          <w:tcPr>
-            <w:tcW w:w="792" w:type="dxa"/>
-            <w:vAlign w:val="center"/>
-          </w:tcPr>
-          <w:p>
-            <w:r>
-              <w:rPr>
-                <w:sz w:val="16"/>
-              </w:rPr>
-              <w:t>✅</w:t>
+            <w:tcW w:w="792" w:type="dxa"/>
+            <w:vAlign w:val="center"/>
+          </w:tcPr>
+          <w:p>
+            <w:r>
+              <w:t>—</w:t>
+            </w:r>
+          </w:p>
+        </w:tc>
+        <w:tc>
+          <w:tcPr>
+            <w:tcW w:w="792" w:type="dxa"/>
+            <w:vAlign w:val="center"/>
+          </w:tcPr>
+          <w:p>
+            <w:r>
+              <w:t>—</w:t>
             </w:r>
           </w:p>
         </w:tc>
@@ -5156,7 +5138,7 @@
               <w:rPr>
                 <w:sz w:val="16"/>
               </w:rPr>
-              <w:t>NEWS_CATEGORY_READ_DETAIL</w:t>
+              <w:t>NEWS_CATEGORY_READ</w:t>
             </w:r>
           </w:p>
         </w:tc>
@@ -5245,21 +5227,21 @@
               <w:rPr>
                 <w:sz w:val="16"/>
               </w:rPr>
-              <w:t>NEWS_CATEGORY_CREATE</w:t>
-            </w:r>
-          </w:p>
-        </w:tc>
-        <w:tc>
-          <w:tcPr>
-            <w:tcW w:w="792" w:type="dxa"/>
-            <w:vAlign w:val="center"/>
-          </w:tcPr>
-          <w:p>
-            <w:r>
-              <w:rPr>
-                <w:sz w:val="16"/>
-              </w:rPr>
-              <w:t>—</w:t>
+              <w:t>NEWS_CATEGORY_READ_DETAIL</w:t>
+            </w:r>
+          </w:p>
+        </w:tc>
+        <w:tc>
+          <w:tcPr>
+            <w:tcW w:w="792" w:type="dxa"/>
+            <w:vAlign w:val="center"/>
+          </w:tcPr>
+          <w:p>
+            <w:r>
+              <w:rPr>
+                <w:sz w:val="16"/>
+              </w:rPr>
+              <w:t>✅</w:t>
             </w:r>
           </w:p>
         </w:tc>
@@ -5273,21 +5255,21 @@
               <w:rPr>
                 <w:sz w:val="16"/>
               </w:rPr>
-              <w:t>—</w:t>
-            </w:r>
-          </w:p>
-        </w:tc>
-        <w:tc>
-          <w:tcPr>
-            <w:tcW w:w="792" w:type="dxa"/>
-            <w:vAlign w:val="center"/>
-          </w:tcPr>
-          <w:p>
-            <w:r>
-              <w:rPr>
-                <w:sz w:val="16"/>
-              </w:rPr>
-              <w:t>—</w:t>
+              <w:t>✅</w:t>
+            </w:r>
+          </w:p>
+        </w:tc>
+        <w:tc>
+          <w:tcPr>
+            <w:tcW w:w="792" w:type="dxa"/>
+            <w:vAlign w:val="center"/>
+          </w:tcPr>
+          <w:p>
+            <w:r>
+              <w:rPr>
+                <w:sz w:val="16"/>
+              </w:rPr>
+              <w:t>✅</w:t>
             </w:r>
           </w:p>
         </w:tc>
@@ -5334,7 +5316,7 @@
               <w:rPr>
                 <w:sz w:val="16"/>
               </w:rPr>
-              <w:t>NEWS_CATEGORY_UPDATE</w:t>
+              <w:t>NEWS_CATEGORY_CREATE</w:t>
             </w:r>
           </w:p>
         </w:tc>
@@ -5423,7 +5405,7 @@
               <w:rPr>
                 <w:sz w:val="16"/>
               </w:rPr>
-              <w:t>NEWS_CATEGORY_DELETE</w:t>
+              <w:t>NEWS_CATEGORY_UPDATE</w:t>
             </w:r>
           </w:p>
         </w:tc>
@@ -5498,7 +5480,7 @@
               <w:rPr>
                 <w:sz w:val="16"/>
               </w:rPr>
-              <w:t>News</w:t>
+              <w:t>News Category</w:t>
             </w:r>
           </w:p>
         </w:tc>
@@ -5512,21 +5494,21 @@
               <w:rPr>
                 <w:sz w:val="16"/>
               </w:rPr>
-              <w:t>NEWS_READ</w:t>
-            </w:r>
-          </w:p>
-        </w:tc>
-        <w:tc>
-          <w:tcPr>
-            <w:tcW w:w="792" w:type="dxa"/>
-            <w:vAlign w:val="center"/>
-          </w:tcPr>
-          <w:p>
-            <w:r>
-              <w:rPr>
-                <w:sz w:val="16"/>
-              </w:rPr>
-              <w:t>✅</w:t>
+              <w:t>NEWS_CATEGORY_DELETE</w:t>
+            </w:r>
+          </w:p>
+        </w:tc>
+        <w:tc>
+          <w:tcPr>
+            <w:tcW w:w="792" w:type="dxa"/>
+            <w:vAlign w:val="center"/>
+          </w:tcPr>
+          <w:p>
+            <w:r>
+              <w:rPr>
+                <w:sz w:val="16"/>
+              </w:rPr>
+              <w:t>—</w:t>
             </w:r>
           </w:p>
         </w:tc>
@@ -5540,21 +5522,21 @@
               <w:rPr>
                 <w:sz w:val="16"/>
               </w:rPr>
-              <w:t>✅</w:t>
-            </w:r>
-          </w:p>
-        </w:tc>
-        <w:tc>
-          <w:tcPr>
-            <w:tcW w:w="792" w:type="dxa"/>
-            <w:vAlign w:val="center"/>
-          </w:tcPr>
-          <w:p>
-            <w:r>
-              <w:rPr>
-                <w:sz w:val="16"/>
-              </w:rPr>
-              <w:t>✅</w:t>
+              <w:t>—</w:t>
+            </w:r>
+          </w:p>
+        </w:tc>
+        <w:tc>
+          <w:tcPr>
+            <w:tcW w:w="792" w:type="dxa"/>
+            <w:vAlign w:val="center"/>
+          </w:tcPr>
+          <w:p>
+            <w:r>
+              <w:rPr>
+                <w:sz w:val="16"/>
+              </w:rPr>
+              <w:t>—</w:t>
             </w:r>
           </w:p>
         </w:tc>
@@ -5601,7 +5583,7 @@
               <w:rPr>
                 <w:sz w:val="16"/>
               </w:rPr>
-              <w:t>NEWS_READ_DETAIL</w:t>
+              <w:t>NEWS_READ</w:t>
             </w:r>
           </w:p>
         </w:tc>
@@ -5690,21 +5672,21 @@
               <w:rPr>
                 <w:sz w:val="16"/>
               </w:rPr>
-              <w:t>NEWS_CREATE</w:t>
-            </w:r>
-          </w:p>
-        </w:tc>
-        <w:tc>
-          <w:tcPr>
-            <w:tcW w:w="792" w:type="dxa"/>
-            <w:vAlign w:val="center"/>
-          </w:tcPr>
-          <w:p>
-            <w:r>
-              <w:rPr>
-                <w:sz w:val="16"/>
-              </w:rPr>
-              <w:t>—</w:t>
+              <w:t>NEWS_READ_DETAIL</w:t>
+            </w:r>
+          </w:p>
+        </w:tc>
+        <w:tc>
+          <w:tcPr>
+            <w:tcW w:w="792" w:type="dxa"/>
+            <w:vAlign w:val="center"/>
+          </w:tcPr>
+          <w:p>
+            <w:r>
+              <w:rPr>
+                <w:sz w:val="16"/>
+              </w:rPr>
+              <w:t>✅</w:t>
             </w:r>
           </w:p>
         </w:tc>
@@ -5718,21 +5700,21 @@
               <w:rPr>
                 <w:sz w:val="16"/>
               </w:rPr>
-              <w:t>—</w:t>
-            </w:r>
-          </w:p>
-        </w:tc>
-        <w:tc>
-          <w:tcPr>
-            <w:tcW w:w="792" w:type="dxa"/>
-            <w:vAlign w:val="center"/>
-          </w:tcPr>
-          <w:p>
-            <w:r>
-              <w:rPr>
-                <w:sz w:val="16"/>
-              </w:rPr>
-              <w:t>—</w:t>
+              <w:t>✅</w:t>
+            </w:r>
+          </w:p>
+        </w:tc>
+        <w:tc>
+          <w:tcPr>
+            <w:tcW w:w="792" w:type="dxa"/>
+            <w:vAlign w:val="center"/>
+          </w:tcPr>
+          <w:p>
+            <w:r>
+              <w:rPr>
+                <w:sz w:val="16"/>
+              </w:rPr>
+              <w:t>✅</w:t>
             </w:r>
           </w:p>
         </w:tc>
@@ -5779,7 +5761,7 @@
               <w:rPr>
                 <w:sz w:val="16"/>
               </w:rPr>
-              <w:t>NEWS_UPDATE</w:t>
+              <w:t>NEWS_CREATE</w:t>
             </w:r>
           </w:p>
         </w:tc>
@@ -5868,7 +5850,7 @@
               <w:rPr>
                 <w:sz w:val="16"/>
               </w:rPr>
-              <w:t>NEWS_DELETE</w:t>
+              <w:t>NEWS_UPDATE</w:t>
             </w:r>
           </w:p>
         </w:tc>
@@ -5957,7 +5939,7 @@
               <w:rPr>
                 <w:sz w:val="16"/>
               </w:rPr>
-              <w:t>NEWS_PUBLISH</w:t>
+              <w:t>NEWS_DELETE</w:t>
             </w:r>
           </w:p>
         </w:tc>
@@ -6046,7 +6028,7 @@
               <w:rPr>
                 <w:sz w:val="16"/>
               </w:rPr>
-              <w:t>NEWS_UNPUBLISH</w:t>
+              <w:t>NEWS_PUBLISH</w:t>
             </w:r>
           </w:p>
         </w:tc>
@@ -6121,7 +6103,7 @@
               <w:rPr>
                 <w:sz w:val="16"/>
               </w:rPr>
-              <w:t>Flight Search</w:t>
+              <w:t>News</w:t>
             </w:r>
           </w:p>
         </w:tc>
@@ -6135,21 +6117,21 @@
               <w:rPr>
                 <w:sz w:val="16"/>
               </w:rPr>
-              <w:t>FLIGHT_SEARCH</w:t>
-            </w:r>
-          </w:p>
-        </w:tc>
-        <w:tc>
-          <w:tcPr>
-            <w:tcW w:w="792" w:type="dxa"/>
-            <w:vAlign w:val="center"/>
-          </w:tcPr>
-          <w:p>
-            <w:r>
-              <w:rPr>
-                <w:sz w:val="16"/>
-              </w:rPr>
-              <w:t>✅</w:t>
+              <w:t>NEWS_UNPUBLISH</w:t>
+            </w:r>
+          </w:p>
+        </w:tc>
+        <w:tc>
+          <w:tcPr>
+            <w:tcW w:w="792" w:type="dxa"/>
+            <w:vAlign w:val="center"/>
+          </w:tcPr>
+          <w:p>
+            <w:r>
+              <w:rPr>
+                <w:sz w:val="16"/>
+              </w:rPr>
+              <w:t>—</w:t>
             </w:r>
           </w:p>
         </w:tc>
@@ -6163,21 +6145,21 @@
               <w:rPr>
                 <w:sz w:val="16"/>
               </w:rPr>
-              <w:t>✅</w:t>
-            </w:r>
-          </w:p>
-        </w:tc>
-        <w:tc>
-          <w:tcPr>
-            <w:tcW w:w="792" w:type="dxa"/>
-            <w:vAlign w:val="center"/>
-          </w:tcPr>
-          <w:p>
-            <w:r>
-              <w:rPr>
-                <w:sz w:val="16"/>
-              </w:rPr>
-              <w:t>✅</w:t>
+              <w:t>—</w:t>
+            </w:r>
+          </w:p>
+        </w:tc>
+        <w:tc>
+          <w:tcPr>
+            <w:tcW w:w="792" w:type="dxa"/>
+            <w:vAlign w:val="center"/>
+          </w:tcPr>
+          <w:p>
+            <w:r>
+              <w:rPr>
+                <w:sz w:val="16"/>
+              </w:rPr>
+              <w:t>—</w:t>
             </w:r>
           </w:p>
         </w:tc>
@@ -6224,7 +6206,7 @@
               <w:rPr>
                 <w:sz w:val="16"/>
               </w:rPr>
-              <w:t>FLIGHT_READ</w:t>
+              <w:t>FLIGHT_SEARCH</w:t>
             </w:r>
           </w:p>
         </w:tc>
@@ -6313,7 +6295,7 @@
               <w:rPr>
                 <w:sz w:val="16"/>
               </w:rPr>
-              <w:t>FLIGHT_DETAIL_READ</w:t>
+              <w:t>FLIGHT_READ</w:t>
             </w:r>
           </w:p>
         </w:tc>
@@ -6388,7 +6370,7 @@
               <w:rPr>
                 <w:sz w:val="16"/>
               </w:rPr>
-              <w:t>Flight</w:t>
+              <w:t>Flight Search</w:t>
             </w:r>
           </w:p>
         </w:tc>
@@ -6402,21 +6384,21 @@
               <w:rPr>
                 <w:sz w:val="16"/>
               </w:rPr>
-              <w:t>FLIGHT_READ</w:t>
-            </w:r>
-          </w:p>
-        </w:tc>
-        <w:tc>
-          <w:tcPr>
-            <w:tcW w:w="792" w:type="dxa"/>
-            <w:vAlign w:val="center"/>
-          </w:tcPr>
-          <w:p>
-            <w:r>
-              <w:rPr>
-                <w:sz w:val="16"/>
-              </w:rPr>
-              <w:t>—</w:t>
+              <w:t>FLIGHT_DETAIL_READ</w:t>
+            </w:r>
+          </w:p>
+        </w:tc>
+        <w:tc>
+          <w:tcPr>
+            <w:tcW w:w="792" w:type="dxa"/>
+            <w:vAlign w:val="center"/>
+          </w:tcPr>
+          <w:p>
+            <w:r>
+              <w:rPr>
+                <w:sz w:val="16"/>
+              </w:rPr>
+              <w:t>✅</w:t>
             </w:r>
           </w:p>
         </w:tc>
@@ -6430,7 +6412,7 @@
               <w:rPr>
                 <w:sz w:val="16"/>
               </w:rPr>
-              <w:t>—</w:t>
+              <w:t>✅</w:t>
             </w:r>
           </w:p>
         </w:tc>
@@ -6491,7 +6473,7 @@
               <w:rPr>
                 <w:sz w:val="16"/>
               </w:rPr>
-              <w:t>FLIGHT_READ_DETAIL</w:t>
+              <w:t>FLIGHT_READ</w:t>
             </w:r>
           </w:p>
         </w:tc>
@@ -6580,7 +6562,7 @@
               <w:rPr>
                 <w:sz w:val="16"/>
               </w:rPr>
-              <w:t>FLIGHT_CREATE</w:t>
+              <w:t>FLIGHT_READ_DETAIL</w:t>
             </w:r>
           </w:p>
         </w:tc>
@@ -6669,7 +6651,7 @@
               <w:rPr>
                 <w:sz w:val="16"/>
               </w:rPr>
-              <w:t>FLIGHT_UPDATE</w:t>
+              <w:t>FLIGHT_CREATE</w:t>
             </w:r>
           </w:p>
         </w:tc>
@@ -6758,7 +6740,7 @@
               <w:rPr>
                 <w:sz w:val="16"/>
               </w:rPr>
-              <w:t>FLIGHT_ACTIVATE</w:t>
+              <w:t>FLIGHT_UPDATE</w:t>
             </w:r>
           </w:p>
         </w:tc>
@@ -6847,7 +6829,7 @@
               <w:rPr>
                 <w:sz w:val="16"/>
               </w:rPr>
-              <w:t>FLIGHT_DEACTIVATE</w:t>
+              <w:t>FLIGHT_ACTIVATE</w:t>
             </w:r>
           </w:p>
         </w:tc>
@@ -6922,7 +6904,7 @@
               <w:rPr>
                 <w:sz w:val="16"/>
               </w:rPr>
-              <w:t>FareClass</w:t>
+              <w:t>Flight</w:t>
             </w:r>
           </w:p>
         </w:tc>
@@ -6936,7 +6918,7 @@
               <w:rPr>
                 <w:sz w:val="16"/>
               </w:rPr>
-              <w:t>FARE_CLASS_READ</w:t>
+              <w:t>FLIGHT_DEACTIVATE</w:t>
             </w:r>
           </w:p>
         </w:tc>
@@ -6978,7 +6960,7 @@
               <w:rPr>
                 <w:sz w:val="16"/>
               </w:rPr>
-              <w:t>—</w:t>
+              <w:t>✅</w:t>
             </w:r>
           </w:p>
         </w:tc>
@@ -7025,7 +7007,7 @@
               <w:rPr>
                 <w:sz w:val="16"/>
               </w:rPr>
-              <w:t>FARE_CLASS_READ_DETAIL</w:t>
+              <w:t>FARE_CLASS_READ</w:t>
             </w:r>
           </w:p>
         </w:tc>
@@ -7114,7 +7096,7 @@
               <w:rPr>
                 <w:sz w:val="16"/>
               </w:rPr>
-              <w:t>FARE_CLASS_CREATE</w:t>
+              <w:t>FARE_CLASS_READ_DETAIL</w:t>
             </w:r>
           </w:p>
         </w:tc>
@@ -7203,7 +7185,7 @@
               <w:rPr>
                 <w:sz w:val="16"/>
               </w:rPr>
-              <w:t>FARE_CLASS_UPDATE</w:t>
+              <w:t>FARE_CLASS_CREATE</w:t>
             </w:r>
           </w:p>
         </w:tc>
@@ -7292,7 +7274,7 @@
               <w:rPr>
                 <w:sz w:val="16"/>
               </w:rPr>
-              <w:t>FARE_CLASS_DELETE</w:t>
+              <w:t>FARE_CLASS_UPDATE</w:t>
             </w:r>
           </w:p>
         </w:tc>
@@ -7367,7 +7349,7 @@
               <w:rPr>
                 <w:sz w:val="16"/>
               </w:rPr>
-              <w:t>FareRule</w:t>
+              <w:t>FareClass</w:t>
             </w:r>
           </w:p>
         </w:tc>
@@ -7381,7 +7363,7 @@
               <w:rPr>
                 <w:sz w:val="16"/>
               </w:rPr>
-              <w:t>FARE_RULE_READ</w:t>
+              <w:t>FARE_CLASS_DELETE</w:t>
             </w:r>
           </w:p>
         </w:tc>
@@ -7470,7 +7452,7 @@
               <w:rPr>
                 <w:sz w:val="16"/>
               </w:rPr>
-              <w:t>FARE_RULE_READ_DETAIL</w:t>
+              <w:t>FARE_RULE_READ</w:t>
             </w:r>
           </w:p>
         </w:tc>
@@ -7559,7 +7541,7 @@
               <w:rPr>
                 <w:sz w:val="16"/>
               </w:rPr>
-              <w:t>FARE_RULE_CREATE</w:t>
+              <w:t>FARE_RULE_READ_DETAIL</w:t>
             </w:r>
           </w:p>
         </w:tc>
@@ -7648,7 +7630,7 @@
               <w:rPr>
                 <w:sz w:val="16"/>
               </w:rPr>
-              <w:t>FARE_RULE_UPDATE</w:t>
+              <w:t>FARE_RULE_CREATE</w:t>
             </w:r>
           </w:p>
         </w:tc>
@@ -7737,7 +7719,7 @@
               <w:rPr>
                 <w:sz w:val="16"/>
               </w:rPr>
-              <w:t>FARE_RULE_DELETE</w:t>
+              <w:t>FARE_RULE_UPDATE</w:t>
             </w:r>
           </w:p>
         </w:tc>
@@ -7812,7 +7794,7 @@
               <w:rPr>
                 <w:sz w:val="16"/>
               </w:rPr>
-              <w:t>BaggageOption</w:t>
+              <w:t>FareRule</w:t>
             </w:r>
           </w:p>
         </w:tc>
@@ -7826,7 +7808,7 @@
               <w:rPr>
                 <w:sz w:val="16"/>
               </w:rPr>
-              <w:t>BAGGAGE_READ</w:t>
+              <w:t>FARE_RULE_DELETE</w:t>
             </w:r>
           </w:p>
         </w:tc>
@@ -7915,7 +7897,7 @@
               <w:rPr>
                 <w:sz w:val="16"/>
               </w:rPr>
-              <w:t>BAGGAGE_READ_DETAIL</w:t>
+              <w:t>BAGGAGE_READ</w:t>
             </w:r>
           </w:p>
         </w:tc>
@@ -8004,7 +7986,7 @@
               <w:rPr>
                 <w:sz w:val="16"/>
               </w:rPr>
-              <w:t>BAGGAGE_CREATE</w:t>
+              <w:t>BAGGAGE_READ_DETAIL</w:t>
             </w:r>
           </w:p>
         </w:tc>
@@ -8093,7 +8075,7 @@
               <w:rPr>
                 <w:sz w:val="16"/>
               </w:rPr>
-              <w:t>BAGGAGE_UPDATE</w:t>
+              <w:t>BAGGAGE_CREATE</w:t>
             </w:r>
           </w:p>
         </w:tc>
@@ -8182,7 +8164,7 @@
               <w:rPr>
                 <w:sz w:val="16"/>
               </w:rPr>
-              <w:t>BAGGAGE_DELETE</w:t>
+              <w:t>BAGGAGE_UPDATE</w:t>
             </w:r>
           </w:p>
         </w:tc>
@@ -8257,7 +8239,7 @@
               <w:rPr>
                 <w:sz w:val="16"/>
               </w:rPr>
-              <w:t>FlightFare</w:t>
+              <w:t>BaggageOption</w:t>
             </w:r>
           </w:p>
         </w:tc>
@@ -8271,7 +8253,7 @@
               <w:rPr>
                 <w:sz w:val="16"/>
               </w:rPr>
-              <w:t>FLIGHT_FARE_READ</w:t>
+              <w:t>BAGGAGE_DELETE</w:t>
             </w:r>
           </w:p>
         </w:tc>
@@ -8360,7 +8342,7 @@
               <w:rPr>
                 <w:sz w:val="16"/>
               </w:rPr>
-              <w:t>FLIGHT_FARE_READ_DETAIL</w:t>
+              <w:t>FLIGHT_FARE_READ</w:t>
             </w:r>
           </w:p>
         </w:tc>
@@ -8449,7 +8431,7 @@
               <w:rPr>
                 <w:sz w:val="16"/>
               </w:rPr>
-              <w:t>FLIGHT_FARE_CREATE</w:t>
+              <w:t>FLIGHT_FARE_READ_DETAIL</w:t>
             </w:r>
           </w:p>
         </w:tc>
@@ -8538,7 +8520,7 @@
               <w:rPr>
                 <w:sz w:val="16"/>
               </w:rPr>
-              <w:t>FLIGHT_FARE_UPDATE</w:t>
+              <w:t>FLIGHT_FARE_CREATE</w:t>
             </w:r>
           </w:p>
         </w:tc>
@@ -8627,7 +8609,7 @@
               <w:rPr>
                 <w:sz w:val="16"/>
               </w:rPr>
-              <w:t>FLIGHT_FARE_DELETE</w:t>
+              <w:t>FLIGHT_FARE_UPDATE</w:t>
             </w:r>
           </w:p>
         </w:tc>
@@ -8702,7 +8684,7 @@
               <w:rPr>
                 <w:sz w:val="16"/>
               </w:rPr>
-              <w:t>FlightSeat Inventory</w:t>
+              <w:t>FlightFare</w:t>
             </w:r>
           </w:p>
         </w:tc>
@@ -8716,7 +8698,7 @@
               <w:rPr>
                 <w:sz w:val="16"/>
               </w:rPr>
-              <w:t>SEAT_INVENTORY_READ</w:t>
+              <w:t>FLIGHT_FARE_DELETE</w:t>
             </w:r>
           </w:p>
         </w:tc>
@@ -8805,7 +8787,7 @@
               <w:rPr>
                 <w:sz w:val="16"/>
               </w:rPr>
-              <w:t>SEAT_INVENTORY_READ_DETAIL</w:t>
+              <w:t>SEAT_INVENTORY_READ</w:t>
             </w:r>
           </w:p>
         </w:tc>
@@ -8894,7 +8876,7 @@
               <w:rPr>
                 <w:sz w:val="16"/>
               </w:rPr>
-              <w:t>SEAT_INVENTORY_MANAGE</w:t>
+              <w:t>SEAT_INVENTORY_READ_DETAIL</w:t>
             </w:r>
           </w:p>
         </w:tc>
@@ -8969,7 +8951,7 @@
               <w:rPr>
                 <w:sz w:val="16"/>
               </w:rPr>
-              <w:t>Passenger</w:t>
+              <w:t>FlightSeat Inventory</w:t>
             </w:r>
           </w:p>
         </w:tc>
@@ -8983,7 +8965,7 @@
               <w:rPr>
                 <w:sz w:val="16"/>
               </w:rPr>
-              <w:t>PASSENGER_CREATE</w:t>
+              <w:t>SEAT_INVENTORY_MANAGE</w:t>
             </w:r>
           </w:p>
         </w:tc>
@@ -9011,35 +8993,35 @@
               <w:rPr>
                 <w:sz w:val="16"/>
               </w:rPr>
+              <w:t>—</w:t>
+            </w:r>
+          </w:p>
+        </w:tc>
+        <w:tc>
+          <w:tcPr>
+            <w:tcW w:w="792" w:type="dxa"/>
+            <w:vAlign w:val="center"/>
+          </w:tcPr>
+          <w:p>
+            <w:r>
+              <w:rPr>
+                <w:sz w:val="16"/>
+              </w:rPr>
+              <w:t>—</w:t>
+            </w:r>
+          </w:p>
+        </w:tc>
+        <w:tc>
+          <w:tcPr>
+            <w:tcW w:w="792" w:type="dxa"/>
+            <w:vAlign w:val="center"/>
+          </w:tcPr>
+          <w:p>
+            <w:r>
+              <w:rPr>
+                <w:sz w:val="16"/>
+              </w:rPr>
               <w:t>✅</w:t>
-            </w:r>
-          </w:p>
-        </w:tc>
-        <w:tc>
-          <w:tcPr>
-            <w:tcW w:w="792" w:type="dxa"/>
-            <w:vAlign w:val="center"/>
-          </w:tcPr>
-          <w:p>
-            <w:r>
-              <w:rPr>
-                <w:sz w:val="16"/>
-              </w:rPr>
-              <w:t>—</w:t>
-            </w:r>
-          </w:p>
-        </w:tc>
-        <w:tc>
-          <w:tcPr>
-            <w:tcW w:w="792" w:type="dxa"/>
-            <w:vAlign w:val="center"/>
-          </w:tcPr>
-          <w:p>
-            <w:r>
-              <w:rPr>
-                <w:sz w:val="16"/>
-              </w:rPr>
-              <w:t>—</w:t>
             </w:r>
           </w:p>
         </w:tc>
@@ -9072,7 +9054,7 @@
               <w:rPr>
                 <w:sz w:val="16"/>
               </w:rPr>
-              <w:t>PASSENGER_READ_SELF</w:t>
+              <w:t>PASSENGER_CREATE</w:t>
             </w:r>
           </w:p>
         </w:tc>
@@ -9161,7 +9143,7 @@
               <w:rPr>
                 <w:sz w:val="16"/>
               </w:rPr>
-              <w:t>PASSENGER_UPDATE_SELF</w:t>
+              <w:t>PASSENGER_READ_SELF</w:t>
             </w:r>
           </w:p>
         </w:tc>
@@ -9236,7 +9218,7 @@
               <w:rPr>
                 <w:sz w:val="16"/>
               </w:rPr>
-              <w:t>Booking</w:t>
+              <w:t>Passenger</w:t>
             </w:r>
           </w:p>
         </w:tc>
@@ -9250,7 +9232,7 @@
               <w:rPr>
                 <w:sz w:val="16"/>
               </w:rPr>
-              <w:t>BOOKING_CREATE</w:t>
+              <w:t>PASSENGER_UPDATE_SELF</w:t>
             </w:r>
           </w:p>
         </w:tc>
@@ -9339,7 +9321,7 @@
               <w:rPr>
                 <w:sz w:val="16"/>
               </w:rPr>
-              <w:t>BOOKING_READ_SELF</w:t>
+              <w:t>BOOKING_CREATE</w:t>
             </w:r>
           </w:p>
         </w:tc>
@@ -9428,7 +9410,7 @@
               <w:rPr>
                 <w:sz w:val="16"/>
               </w:rPr>
-              <w:t>BOOKING_READ</w:t>
+              <w:t>BOOKING_READ_SELF</w:t>
             </w:r>
           </w:p>
         </w:tc>
@@ -9456,20 +9438,6 @@
               <w:rPr>
                 <w:sz w:val="16"/>
               </w:rPr>
-              <w:t>—</w:t>
-            </w:r>
-          </w:p>
-        </w:tc>
-        <w:tc>
-          <w:tcPr>
-            <w:tcW w:w="792" w:type="dxa"/>
-            <w:vAlign w:val="center"/>
-          </w:tcPr>
-          <w:p>
-            <w:r>
-              <w:rPr>
-                <w:sz w:val="16"/>
-              </w:rPr>
               <w:t>✅</w:t>
             </w:r>
           </w:p>
@@ -9484,7 +9452,21 @@
               <w:rPr>
                 <w:sz w:val="16"/>
               </w:rPr>
-              <w:t>✅</w:t>
+              <w:t>—</w:t>
+            </w:r>
+          </w:p>
+        </w:tc>
+        <w:tc>
+          <w:tcPr>
+            <w:tcW w:w="792" w:type="dxa"/>
+            <w:vAlign w:val="center"/>
+          </w:tcPr>
+          <w:p>
+            <w:r>
+              <w:rPr>
+                <w:sz w:val="16"/>
+              </w:rPr>
+              <w:t>—</w:t>
             </w:r>
           </w:p>
         </w:tc>
@@ -9517,7 +9499,7 @@
               <w:rPr>
                 <w:sz w:val="16"/>
               </w:rPr>
-              <w:t>BOOKING_CANCEL_SELF</w:t>
+              <w:t>BOOKING_READ</w:t>
             </w:r>
           </w:p>
         </w:tc>
@@ -9545,6 +9527,20 @@
               <w:rPr>
                 <w:sz w:val="16"/>
               </w:rPr>
+              <w:t>—</w:t>
+            </w:r>
+          </w:p>
+        </w:tc>
+        <w:tc>
+          <w:tcPr>
+            <w:tcW w:w="792" w:type="dxa"/>
+            <w:vAlign w:val="center"/>
+          </w:tcPr>
+          <w:p>
+            <w:r>
+              <w:rPr>
+                <w:sz w:val="16"/>
+              </w:rPr>
               <w:t>✅</w:t>
             </w:r>
           </w:p>
@@ -9559,21 +9555,7 @@
               <w:rPr>
                 <w:sz w:val="16"/>
               </w:rPr>
-              <w:t>—</w:t>
-            </w:r>
-          </w:p>
-        </w:tc>
-        <w:tc>
-          <w:tcPr>
-            <w:tcW w:w="792" w:type="dxa"/>
-            <w:vAlign w:val="center"/>
-          </w:tcPr>
-          <w:p>
-            <w:r>
-              <w:rPr>
-                <w:sz w:val="16"/>
-              </w:rPr>
-              <w:t>—</w:t>
+              <w:t>✅</w:t>
             </w:r>
           </w:p>
         </w:tc>
@@ -9592,7 +9574,7 @@
               <w:rPr>
                 <w:sz w:val="16"/>
               </w:rPr>
-              <w:t>Payment</w:t>
+              <w:t>Booking</w:t>
             </w:r>
           </w:p>
         </w:tc>
@@ -9606,7 +9588,7 @@
               <w:rPr>
                 <w:sz w:val="16"/>
               </w:rPr>
-              <w:t>PAYMENT_CREATE</w:t>
+              <w:t>BOOKING_CANCEL_SELF</w:t>
             </w:r>
           </w:p>
         </w:tc>
@@ -9695,7 +9677,7 @@
               <w:rPr>
                 <w:sz w:val="16"/>
               </w:rPr>
-              <w:t>PAYMENT_READ_SELF</w:t>
+              <w:t>PAYMENT_CREATE</w:t>
             </w:r>
           </w:p>
         </w:tc>
@@ -9770,7 +9752,7 @@
               <w:rPr>
                 <w:sz w:val="16"/>
               </w:rPr>
-              <w:t>E-Ticket</w:t>
+              <w:t>Payment</w:t>
             </w:r>
           </w:p>
         </w:tc>
@@ -9784,7 +9766,7 @@
               <w:rPr>
                 <w:sz w:val="16"/>
               </w:rPr>
-              <w:t>ETICKET_READ_SELF</w:t>
+              <w:t>PAYMENT_READ_SELF</w:t>
             </w:r>
           </w:p>
         </w:tc>
@@ -9859,7 +9841,7 @@
               <w:rPr>
                 <w:sz w:val="16"/>
               </w:rPr>
-              <w:t>Dashboard</w:t>
+              <w:t>E-Ticket</w:t>
             </w:r>
           </w:p>
         </w:tc>
@@ -9873,7 +9855,7 @@
               <w:rPr>
                 <w:sz w:val="16"/>
               </w:rPr>
-              <w:t>DASHBOARD_READ_OPERATIONAL</w:t>
+              <w:t>ETICKET_READ_SELF</w:t>
             </w:r>
           </w:p>
         </w:tc>
@@ -9901,20 +9883,6 @@
               <w:rPr>
                 <w:sz w:val="16"/>
               </w:rPr>
-              <w:t>—</w:t>
-            </w:r>
-          </w:p>
-        </w:tc>
-        <w:tc>
-          <w:tcPr>
-            <w:tcW w:w="792" w:type="dxa"/>
-            <w:vAlign w:val="center"/>
-          </w:tcPr>
-          <w:p>
-            <w:r>
-              <w:rPr>
-                <w:sz w:val="16"/>
-              </w:rPr>
               <w:t>✅</w:t>
             </w:r>
           </w:p>
@@ -9925,16 +9893,25 @@
             <w:vAlign w:val="center"/>
           </w:tcPr>
           <w:p>
-            <w:pPr>
-              <w:rPr>
-                <w:lang w:val="vi-VN"/>
-              </w:rPr>
-            </w:pPr>
-            <w:r>
-              <w:rPr>
-                <w:sz w:val="16"/>
-              </w:rPr>
-              <w:t>✅</w:t>
+            <w:r>
+              <w:rPr>
+                <w:sz w:val="16"/>
+              </w:rPr>
+              <w:t>—</w:t>
+            </w:r>
+          </w:p>
+        </w:tc>
+        <w:tc>
+          <w:tcPr>
+            <w:tcW w:w="792" w:type="dxa"/>
+            <w:vAlign w:val="center"/>
+          </w:tcPr>
+          <w:p>
+            <w:r>
+              <w:rPr>
+                <w:sz w:val="16"/>
+              </w:rPr>
+              <w:t>—</w:t>
             </w:r>
           </w:p>
         </w:tc>
@@ -9950,11 +9927,7 @@
           </w:tcPr>
           <w:p>
             <w:r>
-              <w:rPr>
-                <w:sz w:val="16"/>
-              </w:rPr>
-              <w:lastRenderedPageBreak/>
-              <w:t>Dashboard</w:t>
+              <w:t>Wallet</w:t>
             </w:r>
           </w:p>
         </w:tc>
@@ -9965,23 +9938,17 @@
           </w:tcPr>
           <w:p>
             <w:r>
-              <w:rPr>
-                <w:sz w:val="16"/>
-              </w:rPr>
-              <w:t>DASHBOARD_READ</w:t>
-            </w:r>
-          </w:p>
-        </w:tc>
-        <w:tc>
-          <w:tcPr>
-            <w:tcW w:w="792" w:type="dxa"/>
-            <w:vAlign w:val="center"/>
-          </w:tcPr>
-          <w:p>
-            <w:r>
-              <w:rPr>
-                <w:sz w:val="16"/>
-              </w:rPr>
+              <w:t>WALLET_READ_SELF</w:t>
+            </w:r>
+          </w:p>
+        </w:tc>
+        <w:tc>
+          <w:tcPr>
+            <w:tcW w:w="792" w:type="dxa"/>
+            <w:vAlign w:val="center"/>
+          </w:tcPr>
+          <w:p>
+            <w:r>
               <w:t>—</w:t>
             </w:r>
           </w:p>
@@ -9993,38 +9960,29 @@
           </w:tcPr>
           <w:p>
             <w:r>
-              <w:rPr>
-                <w:sz w:val="16"/>
-              </w:rPr>
-              <w:t>—</w:t>
-            </w:r>
-          </w:p>
-        </w:tc>
-        <w:tc>
-          <w:tcPr>
-            <w:tcW w:w="792" w:type="dxa"/>
-            <w:vAlign w:val="center"/>
-          </w:tcPr>
-          <w:p>
-            <w:r>
-              <w:rPr>
-                <w:sz w:val="16"/>
-              </w:rPr>
-              <w:t>—</w:t>
-            </w:r>
-          </w:p>
-        </w:tc>
-        <w:tc>
-          <w:tcPr>
-            <w:tcW w:w="792" w:type="dxa"/>
-            <w:vAlign w:val="center"/>
-          </w:tcPr>
-          <w:p>
-            <w:r>
-              <w:rPr>
-                <w:sz w:val="16"/>
-              </w:rPr>
               <w:t>✅</w:t>
+            </w:r>
+          </w:p>
+        </w:tc>
+        <w:tc>
+          <w:tcPr>
+            <w:tcW w:w="792" w:type="dxa"/>
+            <w:vAlign w:val="center"/>
+          </w:tcPr>
+          <w:p>
+            <w:r>
+              <w:t>—</w:t>
+            </w:r>
+          </w:p>
+        </w:tc>
+        <w:tc>
+          <w:tcPr>
+            <w:tcW w:w="792" w:type="dxa"/>
+            <w:vAlign w:val="center"/>
+          </w:tcPr>
+          <w:p>
+            <w:r>
+              <w:t>—</w:t>
             </w:r>
           </w:p>
         </w:tc>
@@ -10039,16 +9997,106 @@
             <w:vAlign w:val="center"/>
           </w:tcPr>
           <w:p>
+            <w:r>
+              <w:rPr>
+                <w:sz w:val="16"/>
+              </w:rPr>
+              <w:t>Dashboard</w:t>
+            </w:r>
+          </w:p>
+        </w:tc>
+        <w:tc>
+          <w:tcPr>
+            <w:tcW w:w="2991" w:type="dxa"/>
+            <w:vAlign w:val="center"/>
+          </w:tcPr>
+          <w:p>
+            <w:r>
+              <w:rPr>
+                <w:sz w:val="16"/>
+              </w:rPr>
+              <w:t>DASHBOARD_READ_OPERATIONAL</w:t>
+            </w:r>
+          </w:p>
+        </w:tc>
+        <w:tc>
+          <w:tcPr>
+            <w:tcW w:w="792" w:type="dxa"/>
+            <w:vAlign w:val="center"/>
+          </w:tcPr>
+          <w:p>
+            <w:r>
+              <w:rPr>
+                <w:sz w:val="16"/>
+              </w:rPr>
+              <w:t>—</w:t>
+            </w:r>
+          </w:p>
+        </w:tc>
+        <w:tc>
+          <w:tcPr>
+            <w:tcW w:w="1132" w:type="dxa"/>
+            <w:vAlign w:val="center"/>
+          </w:tcPr>
+          <w:p>
+            <w:r>
+              <w:rPr>
+                <w:sz w:val="16"/>
+              </w:rPr>
+              <w:t>—</w:t>
+            </w:r>
+          </w:p>
+        </w:tc>
+        <w:tc>
+          <w:tcPr>
+            <w:tcW w:w="792" w:type="dxa"/>
+            <w:vAlign w:val="center"/>
+          </w:tcPr>
+          <w:p>
+            <w:r>
+              <w:rPr>
+                <w:sz w:val="16"/>
+              </w:rPr>
+              <w:t>✅</w:t>
+            </w:r>
+          </w:p>
+        </w:tc>
+        <w:tc>
+          <w:tcPr>
+            <w:tcW w:w="792" w:type="dxa"/>
+            <w:vAlign w:val="center"/>
+          </w:tcPr>
+          <w:p>
             <w:pPr>
               <w:rPr>
-                <w:sz w:val="16"/>
+                <w:lang w:val="vi-VN"/>
               </w:rPr>
             </w:pPr>
             <w:r>
               <w:rPr>
                 <w:sz w:val="16"/>
               </w:rPr>
-              <w:t>Notification</w:t>
+              <w:t>✅</w:t>
+            </w:r>
+          </w:p>
+        </w:tc>
+      </w:tr>
+      <w:tr>
+        <w:trPr>
+          <w:jc w:val="center"/>
+        </w:trPr>
+        <w:tc>
+          <w:tcPr>
+            <w:tcW w:w="1728" w:type="dxa"/>
+            <w:vAlign w:val="center"/>
+          </w:tcPr>
+          <w:p>
+            <w:r>
+              <w:rPr>
+                <w:sz w:val="16"/>
+              </w:rPr>
+              <w:lastRenderedPageBreak/>
+              <w:t>Dashboard</w:t>
             </w:r>
           </w:p>
         </w:tc>
@@ -10058,6 +10106,92 @@
             <w:vAlign w:val="center"/>
           </w:tcPr>
           <w:p>
+            <w:r>
+              <w:rPr>
+                <w:sz w:val="16"/>
+              </w:rPr>
+              <w:t>DASHBOARD_READ</w:t>
+            </w:r>
+          </w:p>
+        </w:tc>
+        <w:tc>
+          <w:tcPr>
+            <w:tcW w:w="792" w:type="dxa"/>
+            <w:vAlign w:val="center"/>
+          </w:tcPr>
+          <w:p>
+            <w:r>
+              <w:rPr>
+                <w:sz w:val="16"/>
+              </w:rPr>
+              <w:t>—</w:t>
+            </w:r>
+          </w:p>
+        </w:tc>
+        <w:tc>
+          <w:tcPr>
+            <w:tcW w:w="1132" w:type="dxa"/>
+            <w:vAlign w:val="center"/>
+          </w:tcPr>
+          <w:p>
+            <w:r>
+              <w:rPr>
+                <w:sz w:val="16"/>
+              </w:rPr>
+              <w:t>—</w:t>
+            </w:r>
+          </w:p>
+        </w:tc>
+        <w:tc>
+          <w:tcPr>
+            <w:tcW w:w="792" w:type="dxa"/>
+            <w:vAlign w:val="center"/>
+          </w:tcPr>
+          <w:p>
+            <w:r>
+              <w:rPr>
+                <w:sz w:val="16"/>
+              </w:rPr>
+              <w:t>—</w:t>
+            </w:r>
+          </w:p>
+        </w:tc>
+        <w:tc>
+          <w:tcPr>
+            <w:tcW w:w="792" w:type="dxa"/>
+            <w:vAlign w:val="center"/>
+          </w:tcPr>
+          <w:p>
+            <w:r>
+              <w:rPr>
+                <w:sz w:val="16"/>
+              </w:rPr>
+              <w:t>✅</w:t>
+            </w:r>
+          </w:p>
+        </w:tc>
+      </w:tr>
+      <w:tr>
+        <w:trPr>
+          <w:jc w:val="center"/>
+        </w:trPr>
+        <w:tc>
+          <w:tcPr>
+            <w:tcW w:w="1728" w:type="dxa"/>
+            <w:vAlign w:val="center"/>
+          </w:tcPr>
+          <w:p>
+            <w:r>
+              <w:t>Notification (chưa triển khai)</w:t>
+            </w:r>
+          </w:p>
+        </w:tc>
+        <w:tc>
+          <w:tcPr>
+            <w:tcW w:w="2991" w:type="dxa"/>
+            <w:vAlign w:val="center"/>
+          </w:tcPr>
+          <w:p>
             <w:pPr>
               <w:rPr>
                 <w:sz w:val="16"/>
@@ -10097,17 +10231,8 @@
             <w:vAlign w:val="center"/>
           </w:tcPr>
           <w:p>
-            <w:pPr>
-              <w:rPr>
-                <w:sz w:val="16"/>
-              </w:rPr>
-            </w:pPr>
-            <w:r>
-              <w:rPr>
-                <w:rFonts w:ascii="Segoe UI Emoji" w:hAnsi="Segoe UI Emoji" w:cs="Segoe UI Emoji"/>
-                <w:sz w:val="16"/>
-              </w:rPr>
-              <w:t>✅</w:t>
+            <w:r>
+              <w:t>—</w:t>
             </w:r>
           </w:p>
         </w:tc>
@@ -10151,6 +10276,11 @@
         </w:tc>
       </w:tr>
     </w:tbl>
+    <w:p>
+      <w:r>
+        <w:t>Ghi chú (cập nhật theo DB v0.4, 2026-10-11): thêm VOUCHER_CLAIM (Customer nhận voucher GLOBAL) và WALLET_READ_SELF (Customer xem ví). NOTIFICATION_READ_SELF tạm gỡ vì bảng notifications chưa triển khai giai đoạn này. Refund: hoàn tiền về ví thuộc Phase 3; chỉ hoàn tiền thật qua cổng thanh toán là ngoài phạm vi.</w:t>
+      </w:r>
+    </w:p>
     <w:p>
       <w:pPr>
         <w:pStyle w:val="Heading1"/>
@@ -10504,7 +10634,7 @@
         <w:pStyle w:val="ListBullet"/>
       </w:pPr>
       <w:r>
-        <w:t>Refund</w:t>
+        <w:t>Refund qua cổng thanh toán (hoàn tiền thật) — hoàn tiền về ví đã thuộc Phase 3 (mục 5.5 DB v0.4)</w:t>
       </w:r>
     </w:p>
     <w:p>

</xml_diff>